<commit_message>
Leased lines flyer: guarantee a single page with headroom
Co-Authored-By: Claude Sonnet 5.5 <noreply@anthropic.com>
Claude-Session: https://claude.ai/code/session_01Tngv28N1djZy5yqo2Q1yZ6
</commit_message>
<xml_diff>
--- a/Blake_Telecom_Leased_Lines_Flyer.docx
+++ b/Blake_Telecom_Leased_Lines_Flyer.docx
@@ -161,16 +161,16 @@
         </w:tblBorders>
       </w:tblPr>
       <w:tblGrid>
-        <w:gridCol w:w="5386"/>
-        <w:gridCol w:w="4720"/>
+        <w:gridCol w:w="5736"/>
+        <w:gridCol w:w="4370"/>
       </w:tblGrid>
       <w:tr>
         <w:trPr>
-          <w:trHeight w:val="2700" w:hRule="exact"/>
+          <w:trHeight w:val="2640" w:hRule="exact"/>
         </w:trPr>
         <w:tc>
           <w:tcPr>
-            <w:tcW w:type="dxa" w:w="5386"/>
+            <w:tcW w:type="dxa" w:w="5736"/>
             <w:tcBorders>
               <w:top w:val="none" w:color="FFFFFF" w:sz="0"/>
               <w:left w:val="none" w:color="FFFFFF" w:sz="0"/>
@@ -232,7 +232,7 @@
         </w:tc>
         <w:tc>
           <w:tcPr>
-            <w:tcW w:type="dxa" w:w="4720"/>
+            <w:tcW w:type="dxa" w:w="4370"/>
             <w:tcBorders>
               <w:top w:val="none" w:color="FFFFFF" w:sz="0"/>
               <w:left w:val="none" w:color="FFFFFF" w:sz="0"/>
@@ -255,7 +255,7 @@
             <w:r>
               <w:drawing>
                 <wp:inline distT="0" distB="0" distL="0" distR="0">
-                  <wp:extent cx="3000375" cy="1714500"/>
+                  <wp:extent cx="2771775" cy="1590675"/>
                   <wp:effectExtent t="0" r="0" b="0" l="0"/>
                   <wp:docPr id="2" name="ll_photo.jpg" descr="ll_photo.jpg" title="ll_photo.jpg"/>
                   <wp:cNvGraphicFramePr>
@@ -280,7 +280,7 @@
                         <pic:spPr bwMode="auto">
                           <a:xfrm>
                             <a:off x="0" y="0"/>
-                            <a:ext cx="3000375" cy="1714500"/>
+                            <a:ext cx="2771775" cy="1590675"/>
                           </a:xfrm>
                           <a:prstGeom prst="rect">
                             <a:avLst/>
@@ -298,7 +298,7 @@
     </w:tbl>
     <w:p>
       <w:pPr>
-        <w:spacing w:after="150" w:line="20"/>
+        <w:spacing w:after="170" w:line="20"/>
       </w:pPr>
     </w:p>
     <w:tbl>
@@ -438,9 +438,9 @@
                     <w:right w:val="none" w:color="FFFFFF" w:sz="0"/>
                   </w:tcBorders>
                   <w:tcMar>
-                    <w:top w:type="dxa" w:w="45"/>
+                    <w:top w:type="dxa" w:w="30"/>
                     <w:left w:type="dxa" w:w="0"/>
-                    <w:bottom w:type="dxa" w:w="45"/>
+                    <w:bottom w:type="dxa" w:w="30"/>
                     <w:right w:type="dxa" w:w="80"/>
                   </w:tcMar>
                   <w:vAlign w:val="top"/>
@@ -502,9 +502,9 @@
                     <w:right w:val="none" w:color="FFFFFF" w:sz="0"/>
                   </w:tcBorders>
                   <w:tcMar>
-                    <w:top w:type="dxa" w:w="45"/>
+                    <w:top w:type="dxa" w:w="30"/>
                     <w:left w:type="dxa" w:w="0"/>
-                    <w:bottom w:type="dxa" w:w="45"/>
+                    <w:bottom w:type="dxa" w:w="30"/>
                     <w:right w:type="dxa" w:w="0"/>
                   </w:tcMar>
                   <w:vAlign w:val="top"/>
@@ -553,9 +553,9 @@
                     <w:right w:val="none" w:color="FFFFFF" w:sz="0"/>
                   </w:tcBorders>
                   <w:tcMar>
-                    <w:top w:type="dxa" w:w="45"/>
+                    <w:top w:type="dxa" w:w="30"/>
                     <w:left w:type="dxa" w:w="0"/>
-                    <w:bottom w:type="dxa" w:w="45"/>
+                    <w:bottom w:type="dxa" w:w="30"/>
                     <w:right w:type="dxa" w:w="80"/>
                   </w:tcMar>
                   <w:vAlign w:val="top"/>
@@ -617,9 +617,9 @@
                     <w:right w:val="none" w:color="FFFFFF" w:sz="0"/>
                   </w:tcBorders>
                   <w:tcMar>
-                    <w:top w:type="dxa" w:w="45"/>
+                    <w:top w:type="dxa" w:w="30"/>
                     <w:left w:type="dxa" w:w="0"/>
-                    <w:bottom w:type="dxa" w:w="45"/>
+                    <w:bottom w:type="dxa" w:w="30"/>
                     <w:right w:type="dxa" w:w="0"/>
                   </w:tcMar>
                   <w:vAlign w:val="top"/>
@@ -668,9 +668,9 @@
                     <w:right w:val="none" w:color="FFFFFF" w:sz="0"/>
                   </w:tcBorders>
                   <w:tcMar>
-                    <w:top w:type="dxa" w:w="45"/>
+                    <w:top w:type="dxa" w:w="30"/>
                     <w:left w:type="dxa" w:w="0"/>
-                    <w:bottom w:type="dxa" w:w="45"/>
+                    <w:bottom w:type="dxa" w:w="30"/>
                     <w:right w:type="dxa" w:w="80"/>
                   </w:tcMar>
                   <w:vAlign w:val="top"/>
@@ -732,9 +732,9 @@
                     <w:right w:val="none" w:color="FFFFFF" w:sz="0"/>
                   </w:tcBorders>
                   <w:tcMar>
-                    <w:top w:type="dxa" w:w="45"/>
+                    <w:top w:type="dxa" w:w="30"/>
                     <w:left w:type="dxa" w:w="0"/>
-                    <w:bottom w:type="dxa" w:w="45"/>
+                    <w:bottom w:type="dxa" w:w="30"/>
                     <w:right w:type="dxa" w:w="0"/>
                   </w:tcMar>
                   <w:vAlign w:val="top"/>
@@ -783,9 +783,9 @@
                     <w:right w:val="none" w:color="FFFFFF" w:sz="0"/>
                   </w:tcBorders>
                   <w:tcMar>
-                    <w:top w:type="dxa" w:w="45"/>
+                    <w:top w:type="dxa" w:w="30"/>
                     <w:left w:type="dxa" w:w="0"/>
-                    <w:bottom w:type="dxa" w:w="45"/>
+                    <w:bottom w:type="dxa" w:w="30"/>
                     <w:right w:type="dxa" w:w="80"/>
                   </w:tcMar>
                   <w:vAlign w:val="top"/>
@@ -847,9 +847,9 @@
                     <w:right w:val="none" w:color="FFFFFF" w:sz="0"/>
                   </w:tcBorders>
                   <w:tcMar>
-                    <w:top w:type="dxa" w:w="45"/>
+                    <w:top w:type="dxa" w:w="30"/>
                     <w:left w:type="dxa" w:w="0"/>
-                    <w:bottom w:type="dxa" w:w="45"/>
+                    <w:bottom w:type="dxa" w:w="30"/>
                     <w:right w:type="dxa" w:w="0"/>
                   </w:tcMar>
                   <w:vAlign w:val="top"/>
@@ -891,7 +891,7 @@
     </w:tbl>
     <w:p>
       <w:pPr>
-        <w:spacing w:after="120" w:line="20"/>
+        <w:spacing w:after="130" w:line="20"/>
       </w:pPr>
     </w:p>
     <w:p>
@@ -899,7 +899,7 @@
         <w:pBdr>
           <w:bottom w:val="single" w:color="D3E4F0" w:sz="6" w:space="1"/>
         </w:pBdr>
-        <w:spacing w:after="100" w:before="0"/>
+        <w:spacing w:after="110" w:before="0"/>
       </w:pPr>
     </w:p>
     <w:p>
@@ -978,7 +978,7 @@
                 <w:ilvl w:val="0"/>
                 <w:numId w:val="2"/>
               </w:numPr>
-              <w:spacing w:after="50" w:line="280"/>
+              <w:spacing w:after="35" w:line="270"/>
             </w:pPr>
             <w:r>
               <w:rPr>
@@ -996,7 +996,7 @@
                 <w:ilvl w:val="0"/>
                 <w:numId w:val="2"/>
               </w:numPr>
-              <w:spacing w:after="50" w:line="280"/>
+              <w:spacing w:after="35" w:line="270"/>
             </w:pPr>
             <w:r>
               <w:rPr>
@@ -1014,7 +1014,7 @@
                 <w:ilvl w:val="0"/>
                 <w:numId w:val="2"/>
               </w:numPr>
-              <w:spacing w:after="50" w:line="280"/>
+              <w:spacing w:after="35" w:line="270"/>
             </w:pPr>
             <w:r>
               <w:rPr>
@@ -1062,7 +1062,7 @@
                 <w:ilvl w:val="0"/>
                 <w:numId w:val="2"/>
               </w:numPr>
-              <w:spacing w:after="50" w:line="280"/>
+              <w:spacing w:after="35" w:line="270"/>
             </w:pPr>
             <w:r>
               <w:rPr>
@@ -1080,7 +1080,7 @@
                 <w:ilvl w:val="0"/>
                 <w:numId w:val="2"/>
               </w:numPr>
-              <w:spacing w:after="50" w:line="280"/>
+              <w:spacing w:after="35" w:line="270"/>
             </w:pPr>
             <w:r>
               <w:rPr>
@@ -1098,7 +1098,7 @@
                 <w:ilvl w:val="0"/>
                 <w:numId w:val="2"/>
               </w:numPr>
-              <w:spacing w:after="50" w:line="280"/>
+              <w:spacing w:after="35" w:line="270"/>
             </w:pPr>
             <w:r>
               <w:rPr>
@@ -1146,7 +1146,7 @@
                 <w:ilvl w:val="0"/>
                 <w:numId w:val="2"/>
               </w:numPr>
-              <w:spacing w:after="50" w:line="280"/>
+              <w:spacing w:after="35" w:line="270"/>
             </w:pPr>
             <w:r>
               <w:rPr>
@@ -1164,7 +1164,7 @@
                 <w:ilvl w:val="0"/>
                 <w:numId w:val="2"/>
               </w:numPr>
-              <w:spacing w:after="50" w:line="280"/>
+              <w:spacing w:after="35" w:line="270"/>
             </w:pPr>
             <w:r>
               <w:rPr>
@@ -1182,7 +1182,7 @@
                 <w:ilvl w:val="0"/>
                 <w:numId w:val="2"/>
               </w:numPr>
-              <w:spacing w:after="50" w:line="280"/>
+              <w:spacing w:after="35" w:line="270"/>
             </w:pPr>
             <w:r>
               <w:rPr>
@@ -1198,7 +1198,7 @@
     </w:tbl>
     <w:p>
       <w:pPr>
-        <w:spacing w:after="60" w:line="20"/>
+        <w:spacing w:after="90" w:line="20"/>
       </w:pPr>
     </w:p>
     <w:p>
@@ -1206,7 +1206,7 @@
         <w:pBdr>
           <w:bottom w:val="single" w:color="D3E4F0" w:sz="6" w:space="1"/>
         </w:pBdr>
-        <w:spacing w:after="100" w:before="0"/>
+        <w:spacing w:after="110" w:before="0"/>
       </w:pPr>
     </w:p>
     <w:p>
@@ -1347,7 +1347,7 @@
     </w:tbl>
     <w:p>
       <w:pPr>
-        <w:spacing w:after="110" w:line="20"/>
+        <w:spacing w:after="150" w:line="20"/>
       </w:pPr>
     </w:p>
     <w:tbl>
@@ -1482,9 +1482,21 @@
         </w:tc>
       </w:tr>
     </w:tbl>
+    <w:p>
+      <w:pPr>
+        <w:spacing w:after="0" w:before="0" w:line="20" w:lineRule="exact"/>
+      </w:pPr>
+      <w:r>
+        <w:rPr>
+          <w:sz w:val="2"/>
+          <w:szCs w:val="2"/>
+        </w:rPr>
+        <w:t xml:space="preserve"/>
+      </w:r>
+    </w:p>
     <w:sectPr>
       <w:pgSz w:w="11906" w:h="16838" w:orient="portrait"/>
-      <w:pgMar w:top="480" w:right="900" w:bottom="360" w:left="900" w:header="200" w:footer="200" w:gutter="0"/>
+      <w:pgMar w:top="420" w:right="900" w:bottom="360" w:left="900" w:header="200" w:footer="200" w:gutter="0"/>
       <w:pgNumType/>
       <w:docGrid w:linePitch="360"/>
     </w:sectPr>

</xml_diff>